<commit_message>
chivariga, single line statement heading removed vro
</commit_message>
<xml_diff>
--- a/Folders/MRO/VRO/Statement/VRO report telugu.docx
+++ b/Folders/MRO/VRO/Statement/VRO report telugu.docx
@@ -7,30 +7,10 @@
         <w:jc w:val="center"/>
         <w:rPr>
           <w:rFonts w:cs="Calibri"/>
-          <w:sz w:val="30"/>
-          <w:szCs w:val="30"/>
-          <w:lang w:val="en-US"/>
-        </w:rPr>
-      </w:pPr>
-      <w:r>
-        <w:rPr>
-          <w:rFonts w:cs="Calibri"/>
-          <w:sz w:val="30"/>
-          <w:szCs w:val="30"/>
-          <w:lang w:val="en-US"/>
-        </w:rPr>
-        <w:t>STATEMENT OF</w:t>
-      </w:r>
-    </w:p>
-    <w:p>
-      <w:pPr>
-        <w:jc w:val="center"/>
-        <w:rPr>
-          <w:rFonts w:cs="Calibri"/>
           <w:b/>
           <w:bCs/>
-          <w:sz w:val="26"/>
-          <w:szCs w:val="26"/>
+          <w:sz w:val="28"/>
+          <w:szCs w:val="28"/>
           <w:u w:val="single"/>
           <w:lang w:val="en-US"/>
         </w:rPr>
@@ -40,82 +20,84 @@
           <w:rFonts w:cs="Calibri"/>
           <w:b/>
           <w:bCs/>
-          <w:sz w:val="26"/>
-          <w:szCs w:val="26"/>
+          <w:sz w:val="28"/>
+          <w:szCs w:val="28"/>
           <w:u w:val="single"/>
           <w:lang w:val="en-US"/>
         </w:rPr>
-        <w:t>SRIHARI MADDINENI</w:t>
+        <w:t>STATEMENT OF</w:t>
       </w:r>
       <w:r>
         <w:rPr>
           <w:rFonts w:cs="Calibri"/>
           <w:b/>
           <w:bCs/>
-          <w:sz w:val="26"/>
-          <w:szCs w:val="26"/>
+          <w:sz w:val="28"/>
+          <w:szCs w:val="28"/>
           <w:u w:val="single"/>
           <w:lang w:val="en-US"/>
         </w:rPr>
-        <w:t xml:space="preserve"> ( 23 M  - OC) s/o Ravi M</w:t>
-      </w:r>
-    </w:p>
-    <w:p>
-      <w:pPr>
-        <w:jc w:val="center"/>
+        <w:t xml:space="preserve"> S</w:t>
+      </w:r>
+      <w:r>
         <w:rPr>
           <w:rFonts w:cs="Calibri"/>
           <w:b/>
           <w:bCs/>
-          <w:sz w:val="26"/>
-          <w:szCs w:val="26"/>
+          <w:sz w:val="28"/>
+          <w:szCs w:val="28"/>
           <w:u w:val="single"/>
           <w:lang w:val="en-US"/>
         </w:rPr>
-      </w:pPr>
+        <w:t>RIHARI MADDINENI</w:t>
+      </w:r>
       <w:r>
         <w:rPr>
           <w:rFonts w:cs="Calibri"/>
           <w:b/>
           <w:bCs/>
-          <w:sz w:val="26"/>
-          <w:szCs w:val="26"/>
+          <w:sz w:val="28"/>
+          <w:szCs w:val="28"/>
           <w:u w:val="single"/>
           <w:lang w:val="en-US"/>
         </w:rPr>
-        <w:t xml:space="preserve"> Mittapalem</w:t>
+        <w:t xml:space="preserve"> ( 23 M  - OC) s/o Ravi M</w:t>
       </w:r>
       <w:r>
         <w:rPr>
           <w:rFonts w:cs="Calibri"/>
           <w:b/>
           <w:bCs/>
-          <w:sz w:val="26"/>
-          <w:szCs w:val="26"/>
+          <w:sz w:val="28"/>
+          <w:szCs w:val="28"/>
           <w:u w:val="single"/>
           <w:lang w:val="en-US"/>
         </w:rPr>
+        <w:t xml:space="preserve"> </w:t>
+      </w:r>
+      <w:r>
+        <w:rPr>
+          <w:rFonts w:cs="Calibri"/>
+          <w:b/>
+          <w:bCs/>
+          <w:sz w:val="28"/>
+          <w:szCs w:val="28"/>
+          <w:u w:val="single"/>
+          <w:lang w:val="en-US"/>
+        </w:rPr>
+        <w:t xml:space="preserve"> Mittapalem</w:t>
+      </w:r>
+      <w:r>
+        <w:rPr>
+          <w:rFonts w:cs="Calibri"/>
+          <w:b/>
+          <w:bCs/>
+          <w:sz w:val="28"/>
+          <w:szCs w:val="28"/>
+          <w:u w:val="single"/>
+          <w:lang w:val="en-US"/>
+        </w:rPr>
         <w:t>(v), kondepi(m), Prakasam(dt). A.P. 523273</w:t>
-      </w:r>
-    </w:p>
-    <w:p>
-      <w:pPr>
-        <w:jc w:val="center"/>
-        <w:rPr>
-          <w:rFonts w:cs="Calibri"/>
-          <w:sz w:val="30"/>
-          <w:szCs w:val="30"/>
-          <w:lang w:val="en-US"/>
-        </w:rPr>
-      </w:pPr>
-      <w:r>
-        <w:rPr>
-          <w:rFonts w:cs="Calibri"/>
-          <w:sz w:val="30"/>
-          <w:szCs w:val="30"/>
-          <w:lang w:val="en-US"/>
-        </w:rPr>
-        <w:t xml:space="preserve">RECORDED BY </w:t>
       </w:r>
     </w:p>
     <w:p>
@@ -131,80 +113,6 @@
           <w:lang w:val="en-US"/>
         </w:rPr>
       </w:pPr>
-      <w:r>
-        <w:rPr>
-          <w:rFonts w:cs="Calibri"/>
-          <w:b/>
-          <w:bCs/>
-          <w:sz w:val="30"/>
-          <w:szCs w:val="30"/>
-          <w:u w:val="single"/>
-          <w:lang w:val="en-US"/>
-        </w:rPr>
-        <w:t>V</w:t>
-      </w:r>
-      <w:r>
-        <w:rPr>
-          <w:rFonts w:cs="Calibri"/>
-          <w:b/>
-          <w:bCs/>
-          <w:sz w:val="30"/>
-          <w:szCs w:val="30"/>
-          <w:u w:val="single"/>
-          <w:lang w:val="en-US"/>
-        </w:rPr>
-        <w:t>.</w:t>
-      </w:r>
-      <w:r>
-        <w:rPr>
-          <w:rFonts w:cs="Calibri"/>
-          <w:b/>
-          <w:bCs/>
-          <w:sz w:val="30"/>
-          <w:szCs w:val="30"/>
-          <w:u w:val="single"/>
-          <w:lang w:val="en-US"/>
-        </w:rPr>
-        <w:t>R</w:t>
-      </w:r>
-      <w:r>
-        <w:rPr>
-          <w:rFonts w:cs="Calibri"/>
-          <w:b/>
-          <w:bCs/>
-          <w:sz w:val="30"/>
-          <w:szCs w:val="30"/>
-          <w:u w:val="single"/>
-          <w:lang w:val="en-US"/>
-        </w:rPr>
-        <w:t>.</w:t>
-      </w:r>
-      <w:r>
-        <w:rPr>
-          <w:rFonts w:cs="Calibri"/>
-          <w:b/>
-          <w:bCs/>
-          <w:sz w:val="30"/>
-          <w:szCs w:val="30"/>
-          <w:u w:val="single"/>
-          <w:lang w:val="en-US"/>
-        </w:rPr>
-        <w:t>O NIREESHA</w:t>
-      </w:r>
-    </w:p>
-    <w:p>
-      <w:pPr>
-        <w:jc w:val="center"/>
-        <w:rPr>
-          <w:rFonts w:cs="Calibri"/>
-          <w:b/>
-          <w:bCs/>
-          <w:sz w:val="30"/>
-          <w:szCs w:val="30"/>
-          <w:u w:val="single"/>
-          <w:lang w:val="en-US"/>
-        </w:rPr>
-      </w:pPr>
     </w:p>
     <w:p>
       <w:pPr>
@@ -232,7 +140,43 @@
           <w:bCs/>
           <w:lang w:val="en-US"/>
         </w:rPr>
-        <w:t xml:space="preserve"> VRO </w:t>
+        <w:t xml:space="preserve"> </w:t>
+      </w:r>
+      <w:r>
+        <w:rPr>
+          <w:rFonts w:cs="Calibri"/>
+          <w:b/>
+          <w:bCs/>
+          <w:lang w:val="en-US"/>
+        </w:rPr>
+        <w:t xml:space="preserve"> </w:t>
+      </w:r>
+      <w:r>
+        <w:rPr>
+          <w:rFonts w:ascii="Vani" w:hAnsi="Vani" w:cs="Vani"/>
+          <w:b/>
+          <w:bCs/>
+          <w:lang w:val="en-US"/>
+        </w:rPr>
+        <w:t>సర్</w:t>
+      </w:r>
+      <w:r>
+        <w:rPr>
+          <w:rFonts w:cs="Calibri"/>
+          <w:b/>
+          <w:bCs/>
+          <w:lang w:val="en-US"/>
+        </w:rPr>
+        <w:t xml:space="preserve"> /</w:t>
+      </w:r>
+      <w:r>
+        <w:rPr>
+          <w:rFonts w:cs="Calibri"/>
+          <w:b/>
+          <w:bCs/>
+          <w:lang w:val="en-US"/>
+        </w:rPr>
+        <w:t xml:space="preserve"> </w:t>
       </w:r>
       <w:r>
         <w:rPr>
@@ -2791,7 +2735,6 @@
           <w:rFonts w:ascii="Vani" w:hAnsi="Vani" w:cs="Vani"/>
           <w:lang w:val="en-US"/>
         </w:rPr>
-        <w:lastRenderedPageBreak/>
         <w:t>అదనంగా</w:t>
       </w:r>
       <w:r>
@@ -3586,6 +3529,7 @@
           <w:rFonts w:ascii="Vani" w:hAnsi="Vani" w:cs="Vani"/>
           <w:lang w:val="en-US"/>
         </w:rPr>
+        <w:lastRenderedPageBreak/>
         <w:t>గమనించదగిన</w:t>
       </w:r>
       <w:r>
@@ -6116,7 +6060,6 @@
           <w:u w:val="single"/>
           <w:lang w:val="en-US"/>
         </w:rPr>
-        <w:lastRenderedPageBreak/>
         <w:t xml:space="preserve">Rs. 4,87,000/- Empty cheque: </w:t>
       </w:r>
     </w:p>
@@ -6520,6 +6463,7 @@
           <w:rFonts w:cs="Calibri"/>
           <w:lang w:val="en-US"/>
         </w:rPr>
+        <w:lastRenderedPageBreak/>
         <w:t xml:space="preserve">HR </w:t>
       </w:r>
       <w:r>
@@ -9074,7 +9018,6 @@
           <w:rFonts w:ascii="Vani" w:hAnsi="Vani" w:cs="Vani"/>
           <w:lang w:val="en-US"/>
         </w:rPr>
-        <w:lastRenderedPageBreak/>
         <w:t>పరిస్థితులు</w:t>
       </w:r>
       <w:r>
@@ -9766,6 +9709,7 @@
           <w:u w:val="single"/>
           <w:lang w:val="en-US"/>
         </w:rPr>
+        <w:lastRenderedPageBreak/>
         <w:t>Joining in company on 20 may 2024:</w:t>
       </w:r>
     </w:p>
@@ -11759,7 +11703,6 @@
         <w:rPr>
           <w:rFonts w:ascii="Vani" w:hAnsi="Vani" w:cs="Vani"/>
         </w:rPr>
-        <w:lastRenderedPageBreak/>
         <w:t>వారు</w:t>
       </w:r>
       <w:r>
@@ -12555,6 +12498,7 @@
         <w:rPr>
           <w:rFonts w:ascii="Vani" w:hAnsi="Vani" w:cs="Vani"/>
         </w:rPr>
+        <w:lastRenderedPageBreak/>
         <w:t>అప్పుడప్పుడు</w:t>
       </w:r>
       <w:r>
@@ -13025,7 +12969,29 @@
           <w:szCs w:val="28"/>
           <w:u w:val="single"/>
         </w:rPr>
-        <w:t xml:space="preserve">Role change: </w:t>
+        <w:t>Role change</w:t>
+      </w:r>
+      <w:r>
+        <w:rPr>
+          <w:rFonts w:asciiTheme="minorHAnsi" w:hAnsiTheme="minorHAnsi" w:cs="Calibri"/>
+          <w:b/>
+          <w:bCs/>
+          <w:sz w:val="28"/>
+          <w:szCs w:val="28"/>
+          <w:u w:val="single"/>
+        </w:rPr>
+        <w:t>d to Data research and entry</w:t>
+      </w:r>
+      <w:r>
+        <w:rPr>
+          <w:rFonts w:asciiTheme="minorHAnsi" w:hAnsiTheme="minorHAnsi" w:cs="Calibri"/>
+          <w:b/>
+          <w:bCs/>
+          <w:sz w:val="28"/>
+          <w:szCs w:val="28"/>
+          <w:u w:val="single"/>
+        </w:rPr>
+        <w:t xml:space="preserve">: </w:t>
       </w:r>
     </w:p>
     <w:p>
@@ -14012,15 +13978,6 @@
     <w:p>
       <w:pPr>
         <w:pStyle w:val="NormalWeb"/>
-        <w:ind w:firstLine="720"/>
-        <w:rPr>
-          <w:rFonts w:asciiTheme="minorHAnsi" w:hAnsiTheme="minorHAnsi" w:cs="Calibri"/>
-        </w:rPr>
-      </w:pPr>
-    </w:p>
-    <w:p>
-      <w:pPr>
-        <w:pStyle w:val="NormalWeb"/>
         <w:rPr>
           <w:rFonts w:asciiTheme="minorHAnsi" w:hAnsiTheme="minorHAnsi" w:cs="Calibri"/>
           <w:b/>
@@ -14412,7 +14369,6 @@
         <w:rPr>
           <w:rFonts w:ascii="Vani" w:hAnsi="Vani" w:cs="Vani"/>
         </w:rPr>
-        <w:lastRenderedPageBreak/>
         <w:t>సంభాషణలో</w:t>
       </w:r>
       <w:r>
@@ -14962,6 +14918,7 @@
         <w:rPr>
           <w:rFonts w:asciiTheme="minorHAnsi" w:hAnsiTheme="minorHAnsi" w:cs="Calibri"/>
         </w:rPr>
+        <w:lastRenderedPageBreak/>
         <w:t xml:space="preserve">Manager </w:t>
       </w:r>
       <w:r>
@@ -16725,7 +16682,6 @@
         <w:rPr>
           <w:rFonts w:ascii="Vani" w:hAnsi="Vani" w:cs="Vani"/>
         </w:rPr>
-        <w:lastRenderedPageBreak/>
         <w:t>ఇలా</w:t>
       </w:r>
       <w:r>
@@ -17323,6 +17279,7 @@
           <w:bCs/>
           <w:u w:val="single"/>
         </w:rPr>
+        <w:lastRenderedPageBreak/>
         <w:t>Joint meetings and report by LABOUR DEPARTMENT</w:t>
       </w:r>
       <w:r>
@@ -18526,6 +18483,11 @@
         <w:ind w:firstLine="720"/>
         <w:rPr>
           <w:rFonts w:asciiTheme="minorHAnsi" w:hAnsiTheme="minorHAnsi" w:cs="Calibri"/>
+          <w:b/>
+          <w:bCs/>
+          <w:sz w:val="26"/>
+          <w:szCs w:val="26"/>
+          <w:u w:val="single"/>
         </w:rPr>
       </w:pPr>
     </w:p>
@@ -18535,6 +18497,11 @@
         <w:ind w:firstLine="720"/>
         <w:rPr>
           <w:rFonts w:asciiTheme="minorHAnsi" w:hAnsiTheme="minorHAnsi" w:cs="Calibri"/>
+          <w:b/>
+          <w:bCs/>
+          <w:sz w:val="26"/>
+          <w:szCs w:val="26"/>
+          <w:u w:val="single"/>
         </w:rPr>
       </w:pPr>
     </w:p>
@@ -18544,6 +18511,11 @@
         <w:ind w:firstLine="720"/>
         <w:rPr>
           <w:rFonts w:asciiTheme="minorHAnsi" w:hAnsiTheme="minorHAnsi" w:cs="Calibri"/>
+          <w:b/>
+          <w:bCs/>
+          <w:sz w:val="26"/>
+          <w:szCs w:val="26"/>
+          <w:u w:val="single"/>
         </w:rPr>
       </w:pPr>
     </w:p>
@@ -18569,6 +18541,7 @@
           <w:szCs w:val="26"/>
           <w:u w:val="single"/>
         </w:rPr>
+        <w:lastRenderedPageBreak/>
         <w:t>They started harassment on me and my family:</w:t>
       </w:r>
     </w:p>
@@ -20101,6 +20074,7 @@
           <w:szCs w:val="28"/>
           <w:u w:val="single"/>
         </w:rPr>
+        <w:lastRenderedPageBreak/>
         <w:t>Criminal cheque bounce case on my Mother :</w:t>
       </w:r>
     </w:p>
@@ -21593,7 +21567,6 @@
           <w:sz w:val="28"/>
           <w:szCs w:val="28"/>
         </w:rPr>
-        <w:lastRenderedPageBreak/>
         <w:t>“</w:t>
       </w:r>
       <w:r>
@@ -22411,7 +22384,16 @@
           <w:sz w:val="28"/>
           <w:szCs w:val="28"/>
         </w:rPr>
-        <w:t xml:space="preserve"> company </w:t>
+        <w:t xml:space="preserve"> </w:t>
+      </w:r>
+      <w:r>
+        <w:rPr>
+          <w:rFonts w:asciiTheme="minorHAnsi" w:hAnsiTheme="minorHAnsi" w:cs="Calibri"/>
+          <w:sz w:val="28"/>
+          <w:szCs w:val="28"/>
+        </w:rPr>
+        <w:lastRenderedPageBreak/>
+        <w:t xml:space="preserve">company </w:t>
       </w:r>
       <w:r>
         <w:rPr>
@@ -24553,7 +24535,6 @@
           <w:sz w:val="28"/>
           <w:szCs w:val="28"/>
         </w:rPr>
-        <w:lastRenderedPageBreak/>
         <w:t>ఈ</w:t>
       </w:r>
       <w:r>
@@ -24858,6 +24839,7 @@
           <w:szCs w:val="30"/>
           <w:u w:val="single"/>
         </w:rPr>
+        <w:lastRenderedPageBreak/>
         <w:t>Criminal complaints in 1 town police station ongole.</w:t>
       </w:r>
     </w:p>
@@ -27134,7 +27116,6 @@
           <w:sz w:val="28"/>
           <w:szCs w:val="28"/>
         </w:rPr>
-        <w:lastRenderedPageBreak/>
         <w:t>ఇంతలో</w:t>
       </w:r>
       <w:r>
@@ -27914,6 +27895,7 @@
           <w:sz w:val="28"/>
           <w:szCs w:val="28"/>
         </w:rPr>
+        <w:lastRenderedPageBreak/>
         <w:t>డబ్బులను</w:t>
       </w:r>
       <w:r>
@@ -29972,7 +29954,6 @@
           <w:sz w:val="28"/>
           <w:szCs w:val="28"/>
         </w:rPr>
-        <w:lastRenderedPageBreak/>
         <w:t>ఆ</w:t>
       </w:r>
       <w:r>
@@ -30646,6 +30627,7 @@
           <w:sz w:val="28"/>
           <w:szCs w:val="28"/>
         </w:rPr>
+        <w:lastRenderedPageBreak/>
         <w:t>మరుసటి</w:t>
       </w:r>
       <w:r>
@@ -33371,7 +33353,6 @@
           <w:sz w:val="28"/>
           <w:szCs w:val="28"/>
         </w:rPr>
-        <w:lastRenderedPageBreak/>
         <w:t>తరువాత</w:t>
       </w:r>
       <w:r>
@@ -33916,7 +33897,7 @@
         <w:pStyle w:val="NormalWeb"/>
         <w:ind w:firstLine="360"/>
         <w:rPr>
-          <w:rFonts w:asciiTheme="minorHAnsi" w:hAnsiTheme="minorHAnsi" w:cs="Calibri"/>
+          <w:rFonts w:ascii="Vani" w:hAnsi="Vani" w:cs="Vani"/>
           <w:sz w:val="28"/>
           <w:szCs w:val="28"/>
         </w:rPr>
@@ -34279,6 +34260,7 @@
           <w:sz w:val="28"/>
           <w:szCs w:val="28"/>
         </w:rPr>
+        <w:lastRenderedPageBreak/>
         <w:t>లేదా</w:t>
       </w:r>
       <w:r>
@@ -34507,11 +34489,11 @@
       </w:r>
       <w:r>
         <w:rPr>
-          <w:rFonts w:asciiTheme="minorHAnsi" w:hAnsiTheme="minorHAnsi" w:cs="Calibri"/>
-          <w:sz w:val="28"/>
-          <w:szCs w:val="28"/>
-        </w:rPr>
-        <w:t xml:space="preserve">. </w:t>
+          <w:rFonts w:ascii="Vani" w:hAnsi="Vani" w:cs="Vani"/>
+          <w:sz w:val="28"/>
+          <w:szCs w:val="28"/>
+        </w:rPr>
+        <w:t xml:space="preserve"> .</w:t>
       </w:r>
       <w:r>
         <w:rPr>
@@ -34551,139 +34533,11 @@
           <w:sz w:val="28"/>
           <w:szCs w:val="28"/>
         </w:rPr>
-        <w:t>ఆయనకు</w:t>
-      </w:r>
-      <w:r>
-        <w:rPr>
-          <w:rFonts w:asciiTheme="minorHAnsi" w:hAnsiTheme="minorHAnsi" w:cs="Calibri"/>
-          <w:sz w:val="28"/>
-          <w:szCs w:val="28"/>
-        </w:rPr>
-        <w:t xml:space="preserve"> </w:t>
-      </w:r>
-      <w:r>
-        <w:rPr>
-          <w:rFonts w:ascii="Vani" w:hAnsi="Vani" w:cs="Vani"/>
-          <w:sz w:val="28"/>
-          <w:szCs w:val="28"/>
-        </w:rPr>
-        <w:t>ఫోన్</w:t>
-      </w:r>
-      <w:r>
-        <w:rPr>
-          <w:rFonts w:asciiTheme="minorHAnsi" w:hAnsiTheme="minorHAnsi" w:cs="Calibri"/>
-          <w:sz w:val="28"/>
-          <w:szCs w:val="28"/>
-        </w:rPr>
-        <w:t xml:space="preserve"> </w:t>
-      </w:r>
-      <w:r>
-        <w:rPr>
-          <w:rFonts w:ascii="Vani" w:hAnsi="Vani" w:cs="Vani"/>
-          <w:sz w:val="28"/>
-          <w:szCs w:val="28"/>
-        </w:rPr>
-        <w:t>చేయలేదు</w:t>
-      </w:r>
-      <w:r>
-        <w:rPr>
-          <w:rFonts w:asciiTheme="minorHAnsi" w:hAnsiTheme="minorHAnsi" w:cs="Calibri"/>
-          <w:sz w:val="28"/>
-          <w:szCs w:val="28"/>
-        </w:rPr>
-        <w:t xml:space="preserve">, </w:t>
-      </w:r>
-      <w:r>
-        <w:rPr>
-          <w:rFonts w:ascii="Vani" w:hAnsi="Vani" w:cs="Vani"/>
-          <w:sz w:val="28"/>
-          <w:szCs w:val="28"/>
-        </w:rPr>
-        <w:t>అలాగే</w:t>
-      </w:r>
-      <w:r>
-        <w:rPr>
-          <w:rFonts w:asciiTheme="minorHAnsi" w:hAnsiTheme="minorHAnsi" w:cs="Calibri"/>
-          <w:sz w:val="28"/>
-          <w:szCs w:val="28"/>
-        </w:rPr>
-        <w:t xml:space="preserve"> </w:t>
-      </w:r>
-      <w:r>
-        <w:rPr>
-          <w:rFonts w:ascii="Vani" w:hAnsi="Vani" w:cs="Vani"/>
-          <w:sz w:val="28"/>
-          <w:szCs w:val="28"/>
-        </w:rPr>
-        <w:t>ఆయన</w:t>
-      </w:r>
-      <w:r>
-        <w:rPr>
-          <w:rFonts w:asciiTheme="minorHAnsi" w:hAnsiTheme="minorHAnsi" w:cs="Calibri"/>
-          <w:sz w:val="28"/>
-          <w:szCs w:val="28"/>
-        </w:rPr>
-        <w:t xml:space="preserve"> </w:t>
-      </w:r>
-      <w:r>
-        <w:rPr>
-          <w:rFonts w:ascii="Vani" w:hAnsi="Vani" w:cs="Vani"/>
-          <w:sz w:val="28"/>
-          <w:szCs w:val="28"/>
-        </w:rPr>
-        <w:t>కూడా</w:t>
-      </w:r>
-      <w:r>
-        <w:rPr>
-          <w:rFonts w:asciiTheme="minorHAnsi" w:hAnsiTheme="minorHAnsi" w:cs="Calibri"/>
-          <w:sz w:val="28"/>
-          <w:szCs w:val="28"/>
-        </w:rPr>
-        <w:t xml:space="preserve"> </w:t>
-      </w:r>
-      <w:r>
-        <w:rPr>
-          <w:rFonts w:ascii="Vani" w:hAnsi="Vani" w:cs="Vani"/>
-          <w:sz w:val="28"/>
-          <w:szCs w:val="28"/>
-        </w:rPr>
-        <w:t>నాకు</w:t>
-      </w:r>
-      <w:r>
-        <w:rPr>
-          <w:rFonts w:asciiTheme="minorHAnsi" w:hAnsiTheme="minorHAnsi" w:cs="Calibri"/>
-          <w:sz w:val="28"/>
-          <w:szCs w:val="28"/>
-        </w:rPr>
-        <w:t xml:space="preserve"> </w:t>
-      </w:r>
-      <w:r>
-        <w:rPr>
-          <w:rFonts w:ascii="Vani" w:hAnsi="Vani" w:cs="Vani"/>
-          <w:sz w:val="28"/>
-          <w:szCs w:val="28"/>
-        </w:rPr>
-        <w:t>ఫోన్</w:t>
-      </w:r>
-      <w:r>
-        <w:rPr>
-          <w:rFonts w:asciiTheme="minorHAnsi" w:hAnsiTheme="minorHAnsi" w:cs="Calibri"/>
-          <w:sz w:val="28"/>
-          <w:szCs w:val="28"/>
-        </w:rPr>
-        <w:t xml:space="preserve"> </w:t>
-      </w:r>
-      <w:r>
-        <w:rPr>
-          <w:rFonts w:ascii="Vani" w:hAnsi="Vani" w:cs="Vani"/>
-          <w:sz w:val="28"/>
-          <w:szCs w:val="28"/>
-        </w:rPr>
-        <w:t>చేయలేదు</w:t>
-      </w:r>
-      <w:r>
-        <w:rPr>
-          <w:rFonts w:asciiTheme="minorHAnsi" w:hAnsiTheme="minorHAnsi" w:cs="Calibri"/>
+        <w:t>అంగీకరించలేదు</w:t>
+      </w:r>
+      <w:r>
+        <w:rPr>
+          <w:rFonts w:ascii="Vani" w:hAnsi="Vani" w:cs="Vani"/>
           <w:sz w:val="28"/>
           <w:szCs w:val="28"/>
         </w:rPr>
@@ -34700,6 +34554,14 @@
           <w:szCs w:val="28"/>
         </w:rPr>
       </w:pPr>
+      <w:r>
+        <w:rPr>
+          <w:rFonts w:asciiTheme="minorHAnsi" w:hAnsiTheme="minorHAnsi" w:cs="Calibri"/>
+          <w:sz w:val="28"/>
+          <w:szCs w:val="28"/>
+        </w:rPr>
+        <w:t xml:space="preserve"> </w:t>
+      </w:r>
       <w:r>
         <w:rPr>
           <w:rFonts w:asciiTheme="minorHAnsi" w:hAnsiTheme="minorHAnsi" w:cs="Calibri"/>
@@ -36494,7 +36356,6 @@
           <w:sz w:val="28"/>
           <w:szCs w:val="28"/>
         </w:rPr>
-        <w:lastRenderedPageBreak/>
         <w:t>కొన్ని</w:t>
       </w:r>
       <w:r>
@@ -39375,7 +39236,6 @@
           <w:sz w:val="28"/>
           <w:szCs w:val="28"/>
         </w:rPr>
-        <w:lastRenderedPageBreak/>
         <w:t>కేవలం</w:t>
       </w:r>
       <w:r>
@@ -40120,28 +39980,6 @@
         </w:rPr>
         <w:t>.</w:t>
       </w:r>
-    </w:p>
-    <w:p>
-      <w:pPr>
-        <w:pStyle w:val="NormalWeb"/>
-        <w:ind w:firstLine="360"/>
-        <w:rPr>
-          <w:rFonts w:asciiTheme="minorHAnsi" w:hAnsiTheme="minorHAnsi" w:cs="Calibri"/>
-          <w:sz w:val="28"/>
-          <w:szCs w:val="28"/>
-        </w:rPr>
-      </w:pPr>
-    </w:p>
-    <w:p>
-      <w:pPr>
-        <w:pStyle w:val="NormalWeb"/>
-        <w:ind w:firstLine="360"/>
-        <w:rPr>
-          <w:rFonts w:asciiTheme="minorHAnsi" w:hAnsiTheme="minorHAnsi" w:cs="Calibri"/>
-          <w:sz w:val="28"/>
-          <w:szCs w:val="28"/>
-        </w:rPr>
-      </w:pPr>
     </w:p>
     <w:p>
       <w:pPr>
@@ -40182,6 +40020,7 @@
           <w:szCs w:val="28"/>
           <w:u w:val="single"/>
         </w:rPr>
+        <w:lastRenderedPageBreak/>
         <w:t>False complaint in I town police station ongole:</w:t>
       </w:r>
     </w:p>
@@ -42234,6 +42073,26 @@
         <w:pStyle w:val="NormalWeb"/>
         <w:rPr>
           <w:rFonts w:asciiTheme="minorHAnsi" w:hAnsiTheme="minorHAnsi" w:cs="Calibri"/>
+          <w:sz w:val="30"/>
+          <w:szCs w:val="30"/>
+        </w:rPr>
+      </w:pPr>
+    </w:p>
+    <w:p>
+      <w:pPr>
+        <w:pStyle w:val="NormalWeb"/>
+        <w:rPr>
+          <w:rFonts w:asciiTheme="minorHAnsi" w:hAnsiTheme="minorHAnsi" w:cs="Calibri"/>
+          <w:sz w:val="30"/>
+          <w:szCs w:val="30"/>
+        </w:rPr>
+      </w:pPr>
+    </w:p>
+    <w:p>
+      <w:pPr>
+        <w:pStyle w:val="NormalWeb"/>
+        <w:rPr>
+          <w:rFonts w:asciiTheme="minorHAnsi" w:hAnsiTheme="minorHAnsi" w:cs="Calibri"/>
           <w:b/>
           <w:bCs/>
           <w:sz w:val="34"/>
@@ -42250,7 +42109,8 @@
           <w:szCs w:val="34"/>
           <w:u w:val="single"/>
         </w:rPr>
-        <w:t>ముగింపు</w:t>
+        <w:lastRenderedPageBreak/>
+        <w:t>చివరిగా</w:t>
       </w:r>
       <w:r>
         <w:rPr>
@@ -42272,7 +42132,29 @@
           <w:szCs w:val="34"/>
           <w:u w:val="single"/>
         </w:rPr>
-        <w:t>వాక్యం</w:t>
+        <w:t>నా</w:t>
+      </w:r>
+      <w:r>
+        <w:rPr>
+          <w:rFonts w:asciiTheme="minorHAnsi" w:hAnsiTheme="minorHAnsi" w:cs="Calibri"/>
+          <w:b/>
+          <w:bCs/>
+          <w:sz w:val="34"/>
+          <w:szCs w:val="34"/>
+          <w:u w:val="single"/>
+        </w:rPr>
+        <w:t xml:space="preserve"> </w:t>
+      </w:r>
+      <w:r>
+        <w:rPr>
+          <w:rFonts w:ascii="Vani" w:hAnsi="Vani" w:cs="Vani"/>
+          <w:b/>
+          <w:bCs/>
+          <w:sz w:val="34"/>
+          <w:szCs w:val="34"/>
+          <w:u w:val="single"/>
+        </w:rPr>
+        <w:t>విన్నపం</w:t>
       </w:r>
       <w:r>
         <w:rPr>
@@ -44251,7 +44133,6 @@
           <w:sz w:val="28"/>
           <w:szCs w:val="28"/>
         </w:rPr>
-        <w:lastRenderedPageBreak/>
         <w:t>నేను</w:t>
       </w:r>
       <w:r>
@@ -44651,35 +44532,45 @@
           <w:szCs w:val="28"/>
         </w:rPr>
       </w:pPr>
-    </w:p>
-    <w:p>
-      <w:pPr>
-        <w:pStyle w:val="NormalWeb"/>
-        <w:ind w:firstLine="720"/>
+      <w:r>
+        <w:rPr>
+          <w:rFonts w:ascii="Vani" w:hAnsi="Vani" w:cs="Vani"/>
+          <w:sz w:val="28"/>
+          <w:szCs w:val="28"/>
+        </w:rPr>
+        <w:t>ఈ</w:t>
+      </w:r>
+      <w:r>
         <w:rPr>
           <w:rFonts w:asciiTheme="minorHAnsi" w:hAnsiTheme="minorHAnsi" w:cs="Vani"/>
           <w:sz w:val="28"/>
           <w:szCs w:val="28"/>
         </w:rPr>
-      </w:pPr>
-    </w:p>
-    <w:p>
-      <w:pPr>
-        <w:pStyle w:val="NormalWeb"/>
-        <w:ind w:firstLine="720"/>
+        <w:t xml:space="preserve"> </w:t>
+      </w:r>
+      <w:r>
+        <w:rPr>
+          <w:rFonts w:ascii="Vani" w:hAnsi="Vani" w:cs="Vani"/>
+          <w:sz w:val="28"/>
+          <w:szCs w:val="28"/>
+        </w:rPr>
+        <w:t>పరిస్థితులన్నీ</w:t>
+      </w:r>
+      <w:r>
         <w:rPr>
           <w:rFonts w:asciiTheme="minorHAnsi" w:hAnsiTheme="minorHAnsi" w:cs="Vani"/>
           <w:sz w:val="28"/>
           <w:szCs w:val="28"/>
         </w:rPr>
-      </w:pPr>
-      <w:r>
-        <w:rPr>
-          <w:rFonts w:ascii="Vani" w:hAnsi="Vani" w:cs="Vani"/>
-          <w:sz w:val="28"/>
-          <w:szCs w:val="28"/>
-        </w:rPr>
-        <w:t>ఈ</w:t>
+        <w:t xml:space="preserve"> </w:t>
+      </w:r>
+      <w:r>
+        <w:rPr>
+          <w:rFonts w:ascii="Vani" w:hAnsi="Vani" w:cs="Vani"/>
+          <w:sz w:val="28"/>
+          <w:szCs w:val="28"/>
+        </w:rPr>
+        <w:t>ఆ</w:t>
       </w:r>
       <w:r>
         <w:rPr>
@@ -44695,7 +44586,7 @@
           <w:sz w:val="28"/>
           <w:szCs w:val="28"/>
         </w:rPr>
-        <w:t>పరిస్థితులన్నీ</w:t>
+        <w:t>సంస్థ</w:t>
       </w:r>
       <w:r>
         <w:rPr>
@@ -44711,7 +44602,7 @@
           <w:sz w:val="28"/>
           <w:szCs w:val="28"/>
         </w:rPr>
-        <w:t>ఆ</w:t>
+        <w:t>నాపై</w:t>
       </w:r>
       <w:r>
         <w:rPr>
@@ -44727,7 +44618,7 @@
           <w:sz w:val="28"/>
           <w:szCs w:val="28"/>
         </w:rPr>
-        <w:t>సంస్థ</w:t>
+        <w:t>వ్యక్తిగత</w:t>
       </w:r>
       <w:r>
         <w:rPr>
@@ -44743,7 +44634,7 @@
           <w:sz w:val="28"/>
           <w:szCs w:val="28"/>
         </w:rPr>
-        <w:t>నాపై</w:t>
+        <w:t>ద్వేషంతో</w:t>
       </w:r>
       <w:r>
         <w:rPr>
@@ -44759,7 +44650,7 @@
           <w:sz w:val="28"/>
           <w:szCs w:val="28"/>
         </w:rPr>
-        <w:t>వ్యక్తిగత</w:t>
+        <w:t>వ్యవహరించిందని</w:t>
       </w:r>
       <w:r>
         <w:rPr>
@@ -44775,7 +44666,7 @@
           <w:sz w:val="28"/>
           <w:szCs w:val="28"/>
         </w:rPr>
-        <w:t>ద్వేషంతో</w:t>
+        <w:t>నిరూపిస్తున్నాయి</w:t>
       </w:r>
       <w:r>
         <w:rPr>
@@ -44783,15 +44674,15 @@
           <w:sz w:val="28"/>
           <w:szCs w:val="28"/>
         </w:rPr>
-        <w:t xml:space="preserve"> </w:t>
-      </w:r>
-      <w:r>
-        <w:rPr>
-          <w:rFonts w:ascii="Vani" w:hAnsi="Vani" w:cs="Vani"/>
-          <w:sz w:val="28"/>
-          <w:szCs w:val="28"/>
-        </w:rPr>
-        <w:t>వ్యవహరించిందని</w:t>
+        <w:t xml:space="preserve">. </w:t>
+      </w:r>
+      <w:r>
+        <w:rPr>
+          <w:rFonts w:ascii="Vani" w:hAnsi="Vani" w:cs="Vani"/>
+          <w:sz w:val="28"/>
+          <w:szCs w:val="28"/>
+        </w:rPr>
+        <w:t>ఇది</w:t>
       </w:r>
       <w:r>
         <w:rPr>
@@ -44799,15 +44690,15 @@
           <w:sz w:val="28"/>
           <w:szCs w:val="28"/>
         </w:rPr>
-        <w:t xml:space="preserve"> </w:t>
-      </w:r>
-      <w:r>
-        <w:rPr>
-          <w:rFonts w:ascii="Vani" w:hAnsi="Vani" w:cs="Vani"/>
-          <w:sz w:val="28"/>
-          <w:szCs w:val="28"/>
-        </w:rPr>
-        <w:t>నిరూపిస్తున్నాయి</w:t>
+        <w:t xml:space="preserve"> Bonded labour system, harassment, criminal intimidation, </w:t>
+      </w:r>
+      <w:r>
+        <w:rPr>
+          <w:rFonts w:ascii="Vani" w:hAnsi="Vani" w:cs="Vani"/>
+          <w:sz w:val="28"/>
+          <w:szCs w:val="28"/>
+        </w:rPr>
+        <w:t>నియామకర్త</w:t>
       </w:r>
       <w:r>
         <w:rPr>
@@ -44815,46 +44706,15 @@
           <w:sz w:val="28"/>
           <w:szCs w:val="28"/>
         </w:rPr>
-        <w:t xml:space="preserve">. </w:t>
-      </w:r>
-      <w:r>
-        <w:rPr>
-          <w:rFonts w:ascii="Vani" w:hAnsi="Vani" w:cs="Vani"/>
-          <w:sz w:val="28"/>
-          <w:szCs w:val="28"/>
-        </w:rPr>
-        <w:t>ఇది</w:t>
-      </w:r>
-      <w:r>
-        <w:rPr>
-          <w:rFonts w:asciiTheme="minorHAnsi" w:hAnsiTheme="minorHAnsi" w:cs="Vani"/>
-          <w:sz w:val="28"/>
-          <w:szCs w:val="28"/>
-        </w:rPr>
-        <w:t xml:space="preserve"> Bonded labour system, harassment, criminal intimidation, </w:t>
-      </w:r>
-      <w:r>
-        <w:rPr>
-          <w:rFonts w:ascii="Vani" w:hAnsi="Vani" w:cs="Vani"/>
-          <w:sz w:val="28"/>
-          <w:szCs w:val="28"/>
-        </w:rPr>
-        <w:t>నియామకర్త</w:t>
-      </w:r>
-      <w:r>
-        <w:rPr>
-          <w:rFonts w:asciiTheme="minorHAnsi" w:hAnsiTheme="minorHAnsi" w:cs="Vani"/>
-          <w:sz w:val="28"/>
-          <w:szCs w:val="28"/>
-        </w:rPr>
-        <w:t xml:space="preserve"> </w:t>
-      </w:r>
-      <w:r>
-        <w:rPr>
-          <w:rFonts w:ascii="Vani" w:hAnsi="Vani" w:cs="Vani"/>
-          <w:sz w:val="28"/>
-          <w:szCs w:val="28"/>
-        </w:rPr>
+        <w:t xml:space="preserve"> </w:t>
+      </w:r>
+      <w:r>
+        <w:rPr>
+          <w:rFonts w:ascii="Vani" w:hAnsi="Vani" w:cs="Vani"/>
+          <w:sz w:val="28"/>
+          <w:szCs w:val="28"/>
+        </w:rPr>
+        <w:lastRenderedPageBreak/>
         <w:t>కర్తవ్యాలు</w:t>
       </w:r>
       <w:r>

</xml_diff>